<commit_message>
new specs and smart contract to review
</commit_message>
<xml_diff>
--- a/specs/Relais_Backend_Specs_v1.docx
+++ b/specs/Relais_Backend_Specs_v1.docx
@@ -56,7 +56,7 @@
           <w:sz w:val="22"/>
           <w:szCs w:val="22"/>
         </w:rPr>
-        <w:t xml:space="preserve">Backend Specs — Version 1.1</w:t>
+        <w:t xml:space="preserve">Backend Specs — Version 1.2</w:t>
       </w:r>
     </w:p>
     <w:p>
@@ -73,7 +73,7 @@
           <w:sz w:val="18"/>
           <w:szCs w:val="18"/>
         </w:rPr>
-        <w:t xml:space="preserve">v1.1 — API REST, BullMQ, intégrations. Toutes corrections intégrées.</w:t>
+        <w:t xml:space="preserve">v1.2 — Corrections B.1-B.7, D.1-D.5 appliquées.</w:t>
       </w:r>
     </w:p>
     <w:p>
@@ -5261,6 +5261,1989 @@
     </w:p>
     <w:p>
       <w:pPr>
+        <w:pStyle w:val="Heading1"/>
+        <w:spacing w:after="200" w:before="480"/>
+      </w:pPr>
+      <w:r>
+        <w:rPr>
+          <w:rFonts w:ascii="Arial" w:cs="Arial" w:eastAsia="Arial" w:hAnsi="Arial"/>
+          <w:b/>
+          <w:bCs/>
+          <w:color w:val="5C3A0F"/>
+          <w:sz w:val="36"/>
+          <w:szCs w:val="36"/>
+        </w:rPr>
+        <w:t xml:space="preserve">Corrections v1.2</w:t>
+      </w:r>
+    </w:p>
+    <w:tbl>
+      <w:tblPr>
+        <w:tblW w:type="dxa" w:w="9360"/>
+        <w:tblBorders>
+          <w:top w:val="single" w:color="auto" w:sz="4"/>
+          <w:left w:val="single" w:color="auto" w:sz="4"/>
+          <w:bottom w:val="single" w:color="auto" w:sz="4"/>
+          <w:right w:val="single" w:color="auto" w:sz="4"/>
+          <w:insideH w:val="single" w:color="auto" w:sz="4"/>
+          <w:insideV w:val="single" w:color="auto" w:sz="4"/>
+        </w:tblBorders>
+      </w:tblPr>
+      <w:tblGrid>
+        <w:gridCol w:w="4680"/>
+        <w:gridCol w:w="4680"/>
+      </w:tblGrid>
+      <w:tr>
+        <w:tc>
+          <w:tcPr>
+            <w:tcW w:type="dxa" w:w="4680"/>
+            <w:tcBorders>
+              <w:top w:val="single" w:color="E8DDD0" w:sz="1"/>
+              <w:left w:val="single" w:color="E8DDD0" w:sz="1"/>
+              <w:bottom w:val="single" w:color="E8DDD0" w:sz="1"/>
+              <w:right w:val="single" w:color="E8DDD0" w:sz="1"/>
+            </w:tcBorders>
+            <w:shd w:fill="5C3A0F" w:val="clear"/>
+            <w:tcMar>
+              <w:top w:type="dxa" w:w="80"/>
+              <w:left w:type="dxa" w:w="160"/>
+              <w:bottom w:type="dxa" w:w="80"/>
+              <w:right w:type="dxa" w:w="160"/>
+            </w:tcMar>
+          </w:tcPr>
+          <w:p>
+            <w:r>
+              <w:rPr>
+                <w:rFonts w:ascii="Arial" w:cs="Arial" w:eastAsia="Arial" w:hAnsi="Arial"/>
+                <w:b/>
+                <w:bCs/>
+                <w:color w:val="FFFFFF"/>
+                <w:sz w:val="20"/>
+                <w:szCs w:val="20"/>
+              </w:rPr>
+              <w:t xml:space="preserve">Ref</w:t>
+            </w:r>
+          </w:p>
+        </w:tc>
+        <w:tc>
+          <w:tcPr>
+            <w:tcW w:type="dxa" w:w="4680"/>
+            <w:tcBorders>
+              <w:top w:val="single" w:color="E8DDD0" w:sz="1"/>
+              <w:left w:val="single" w:color="E8DDD0" w:sz="1"/>
+              <w:bottom w:val="single" w:color="E8DDD0" w:sz="1"/>
+              <w:right w:val="single" w:color="E8DDD0" w:sz="1"/>
+            </w:tcBorders>
+            <w:shd w:fill="5C3A0F" w:val="clear"/>
+            <w:tcMar>
+              <w:top w:type="dxa" w:w="80"/>
+              <w:left w:type="dxa" w:w="160"/>
+              <w:bottom w:type="dxa" w:w="80"/>
+              <w:right w:type="dxa" w:w="160"/>
+            </w:tcMar>
+          </w:tcPr>
+          <w:p>
+            <w:r>
+              <w:rPr>
+                <w:rFonts w:ascii="Arial" w:cs="Arial" w:eastAsia="Arial" w:hAnsi="Arial"/>
+                <w:b/>
+                <w:bCs/>
+                <w:color w:val="FFFFFF"/>
+                <w:sz w:val="20"/>
+                <w:szCs w:val="20"/>
+              </w:rPr>
+              <w:t xml:space="preserve">Changement</w:t>
+            </w:r>
+          </w:p>
+        </w:tc>
+      </w:tr>
+      <w:tr>
+        <w:tc>
+          <w:tcPr>
+            <w:tcW w:type="dxa" w:w="4680"/>
+            <w:tcBorders>
+              <w:top w:val="single" w:color="E8DDD0" w:sz="1"/>
+              <w:left w:val="single" w:color="E8DDD0" w:sz="1"/>
+              <w:bottom w:val="single" w:color="E8DDD0" w:sz="1"/>
+              <w:right w:val="single" w:color="E8DDD0" w:sz="1"/>
+            </w:tcBorders>
+            <w:shd w:fill="FAF3E8" w:val="clear"/>
+            <w:tcMar>
+              <w:top w:type="dxa" w:w="80"/>
+              <w:left w:type="dxa" w:w="160"/>
+              <w:bottom w:type="dxa" w:w="80"/>
+              <w:right w:type="dxa" w:w="160"/>
+            </w:tcMar>
+          </w:tcPr>
+          <w:p>
+            <w:r>
+              <w:rPr>
+                <w:rFonts w:ascii="Arial" w:cs="Arial" w:eastAsia="Arial" w:hAnsi="Arial"/>
+                <w:b/>
+                <w:bCs/>
+                <w:color w:val="1A1A1A"/>
+                <w:sz w:val="20"/>
+                <w:szCs w:val="20"/>
+              </w:rPr>
+              <w:t xml:space="preserve">B.1</w:t>
+            </w:r>
+          </w:p>
+        </w:tc>
+        <w:tc>
+          <w:tcPr>
+            <w:tcW w:type="dxa" w:w="4680"/>
+            <w:tcBorders>
+              <w:top w:val="single" w:color="E8DDD0" w:sz="1"/>
+              <w:left w:val="single" w:color="E8DDD0" w:sz="1"/>
+              <w:bottom w:val="single" w:color="E8DDD0" w:sz="1"/>
+              <w:right w:val="single" w:color="E8DDD0" w:sz="1"/>
+            </w:tcBorders>
+            <w:shd w:fill="FAF3E8" w:val="clear"/>
+            <w:tcMar>
+              <w:top w:type="dxa" w:w="80"/>
+              <w:left w:type="dxa" w:w="160"/>
+              <w:bottom w:type="dxa" w:w="80"/>
+              <w:right w:type="dxa" w:w="160"/>
+            </w:tcMar>
+          </w:tcPr>
+          <w:p>
+            <w:r>
+              <w:rPr>
+                <w:rFonts w:ascii="Arial" w:cs="Arial" w:eastAsia="Arial" w:hAnsi="Arial"/>
+                <w:b w:val="false"/>
+                <w:bCs w:val="false"/>
+                <w:color w:val="1A1A1A"/>
+                <w:sz w:val="20"/>
+                <w:szCs w:val="20"/>
+              </w:rPr>
+              <w:t xml:space="preserve">POST /transmission/activate : client envoie octets Si (pas chemins). Serveur choisit path, calcule hash.</w:t>
+            </w:r>
+          </w:p>
+        </w:tc>
+      </w:tr>
+      <w:tr>
+        <w:tc>
+          <w:tcPr>
+            <w:tcW w:type="dxa" w:w="4680"/>
+            <w:tcBorders>
+              <w:top w:val="single" w:color="E8DDD0" w:sz="1"/>
+              <w:left w:val="single" w:color="E8DDD0" w:sz="1"/>
+              <w:bottom w:val="single" w:color="E8DDD0" w:sz="1"/>
+              <w:right w:val="single" w:color="E8DDD0" w:sz="1"/>
+            </w:tcBorders>
+            <w:shd w:fill="FFFFFF" w:val="clear"/>
+            <w:tcMar>
+              <w:top w:type="dxa" w:w="80"/>
+              <w:left w:type="dxa" w:w="160"/>
+              <w:bottom w:type="dxa" w:w="80"/>
+              <w:right w:type="dxa" w:w="160"/>
+            </w:tcMar>
+          </w:tcPr>
+          <w:p>
+            <w:r>
+              <w:rPr>
+                <w:rFonts w:ascii="Arial" w:cs="Arial" w:eastAsia="Arial" w:hAnsi="Arial"/>
+                <w:b/>
+                <w:bCs/>
+                <w:color w:val="1A1A1A"/>
+                <w:sz w:val="20"/>
+                <w:szCs w:val="20"/>
+              </w:rPr>
+              <w:t xml:space="preserve">B.2</w:t>
+            </w:r>
+          </w:p>
+        </w:tc>
+        <w:tc>
+          <w:tcPr>
+            <w:tcW w:type="dxa" w:w="4680"/>
+            <w:tcBorders>
+              <w:top w:val="single" w:color="E8DDD0" w:sz="1"/>
+              <w:left w:val="single" w:color="E8DDD0" w:sz="1"/>
+              <w:bottom w:val="single" w:color="E8DDD0" w:sz="1"/>
+              <w:right w:val="single" w:color="E8DDD0" w:sz="1"/>
+            </w:tcBorders>
+            <w:shd w:fill="FFFFFF" w:val="clear"/>
+            <w:tcMar>
+              <w:top w:type="dxa" w:w="80"/>
+              <w:left w:type="dxa" w:w="160"/>
+              <w:bottom w:type="dxa" w:w="80"/>
+              <w:right w:type="dxa" w:w="160"/>
+            </w:tcMar>
+          </w:tcPr>
+          <w:p>
+            <w:r>
+              <w:rPr>
+                <w:rFonts w:ascii="Arial" w:cs="Arial" w:eastAsia="Arial" w:hAnsi="Arial"/>
+                <w:b w:val="false"/>
+                <w:bCs w:val="false"/>
+                <w:color w:val="1A1A1A"/>
+                <w:sz w:val="20"/>
+                <w:szCs w:val="20"/>
+              </w:rPr>
+              <w:t xml:space="preserve">POST /transmission/contacts/:id/verify { signature } — vérification locale app, attestation signée.</w:t>
+            </w:r>
+          </w:p>
+        </w:tc>
+      </w:tr>
+      <w:tr>
+        <w:tc>
+          <w:tcPr>
+            <w:tcW w:type="dxa" w:w="4680"/>
+            <w:tcBorders>
+              <w:top w:val="single" w:color="E8DDD0" w:sz="1"/>
+              <w:left w:val="single" w:color="E8DDD0" w:sz="1"/>
+              <w:bottom w:val="single" w:color="E8DDD0" w:sz="1"/>
+              <w:right w:val="single" w:color="E8DDD0" w:sz="1"/>
+            </w:tcBorders>
+            <w:shd w:fill="FAF3E8" w:val="clear"/>
+            <w:tcMar>
+              <w:top w:type="dxa" w:w="80"/>
+              <w:left w:type="dxa" w:w="160"/>
+              <w:bottom w:type="dxa" w:w="80"/>
+              <w:right w:type="dxa" w:w="160"/>
+            </w:tcMar>
+          </w:tcPr>
+          <w:p>
+            <w:r>
+              <w:rPr>
+                <w:rFonts w:ascii="Arial" w:cs="Arial" w:eastAsia="Arial" w:hAnsi="Arial"/>
+                <w:b/>
+                <w:bCs/>
+                <w:color w:val="1A1A1A"/>
+                <w:sz w:val="20"/>
+                <w:szCs w:val="20"/>
+              </w:rPr>
+              <w:t xml:space="preserve">B.3</w:t>
+            </w:r>
+          </w:p>
+        </w:tc>
+        <w:tc>
+          <w:tcPr>
+            <w:tcW w:type="dxa" w:w="4680"/>
+            <w:tcBorders>
+              <w:top w:val="single" w:color="E8DDD0" w:sz="1"/>
+              <w:left w:val="single" w:color="E8DDD0" w:sz="1"/>
+              <w:bottom w:val="single" w:color="E8DDD0" w:sz="1"/>
+              <w:right w:val="single" w:color="E8DDD0" w:sz="1"/>
+            </w:tcBorders>
+            <w:shd w:fill="FAF3E8" w:val="clear"/>
+            <w:tcMar>
+              <w:top w:type="dxa" w:w="80"/>
+              <w:left w:type="dxa" w:w="160"/>
+              <w:bottom w:type="dxa" w:w="80"/>
+              <w:right w:type="dxa" w:w="160"/>
+            </w:tcMar>
+          </w:tcPr>
+          <w:p>
+            <w:r>
+              <w:rPr>
+                <w:rFonts w:ascii="Arial" w:cs="Arial" w:eastAsia="Arial" w:hAnsi="Arial"/>
+                <w:b w:val="false"/>
+                <w:bCs w:val="false"/>
+                <w:color w:val="1A1A1A"/>
+                <w:sz w:val="20"/>
+                <w:szCs w:val="20"/>
+              </w:rPr>
+              <w:t xml:space="preserve">DEC-33 : bibliothèque intégrée serveur, jeton opaque, réponse jamais transmise au client.</w:t>
+            </w:r>
+          </w:p>
+        </w:tc>
+      </w:tr>
+      <w:tr>
+        <w:tc>
+          <w:tcPr>
+            <w:tcW w:type="dxa" w:w="4680"/>
+            <w:tcBorders>
+              <w:top w:val="single" w:color="E8DDD0" w:sz="1"/>
+              <w:left w:val="single" w:color="E8DDD0" w:sz="1"/>
+              <w:bottom w:val="single" w:color="E8DDD0" w:sz="1"/>
+              <w:right w:val="single" w:color="E8DDD0" w:sz="1"/>
+            </w:tcBorders>
+            <w:shd w:fill="FFFFFF" w:val="clear"/>
+            <w:tcMar>
+              <w:top w:type="dxa" w:w="80"/>
+              <w:left w:type="dxa" w:w="160"/>
+              <w:bottom w:type="dxa" w:w="80"/>
+              <w:right w:type="dxa" w:w="160"/>
+            </w:tcMar>
+          </w:tcPr>
+          <w:p>
+            <w:r>
+              <w:rPr>
+                <w:rFonts w:ascii="Arial" w:cs="Arial" w:eastAsia="Arial" w:hAnsi="Arial"/>
+                <w:b/>
+                <w:bCs/>
+                <w:color w:val="1A1A1A"/>
+                <w:sz w:val="20"/>
+                <w:szCs w:val="20"/>
+              </w:rPr>
+              <w:t xml:space="preserve">B.4</w:t>
+            </w:r>
+          </w:p>
+        </w:tc>
+        <w:tc>
+          <w:tcPr>
+            <w:tcW w:type="dxa" w:w="4680"/>
+            <w:tcBorders>
+              <w:top w:val="single" w:color="E8DDD0" w:sz="1"/>
+              <w:left w:val="single" w:color="E8DDD0" w:sz="1"/>
+              <w:bottom w:val="single" w:color="E8DDD0" w:sz="1"/>
+              <w:right w:val="single" w:color="E8DDD0" w:sz="1"/>
+            </w:tcBorders>
+            <w:shd w:fill="FFFFFF" w:val="clear"/>
+            <w:tcMar>
+              <w:top w:type="dxa" w:w="80"/>
+              <w:left w:type="dxa" w:w="160"/>
+              <w:bottom w:type="dxa" w:w="80"/>
+              <w:right w:type="dxa" w:w="160"/>
+            </w:tcMar>
+          </w:tcPr>
+          <w:p>
+            <w:r>
+              <w:rPr>
+                <w:rFonts w:ascii="Arial" w:cs="Arial" w:eastAsia="Arial" w:hAnsi="Arial"/>
+                <w:b w:val="false"/>
+                <w:bCs w:val="false"/>
+                <w:color w:val="1A1A1A"/>
+                <w:sz w:val="20"/>
+                <w:szCs w:val="20"/>
+              </w:rPr>
+              <w:t xml:space="preserve">POST /relay/:token/verify : { shares:{k1?,k2?,k3?} } ou { failed:true }.</w:t>
+            </w:r>
+          </w:p>
+        </w:tc>
+      </w:tr>
+      <w:tr>
+        <w:tc>
+          <w:tcPr>
+            <w:tcW w:type="dxa" w:w="4680"/>
+            <w:tcBorders>
+              <w:top w:val="single" w:color="E8DDD0" w:sz="1"/>
+              <w:left w:val="single" w:color="E8DDD0" w:sz="1"/>
+              <w:bottom w:val="single" w:color="E8DDD0" w:sz="1"/>
+              <w:right w:val="single" w:color="E8DDD0" w:sz="1"/>
+            </w:tcBorders>
+            <w:shd w:fill="FAF3E8" w:val="clear"/>
+            <w:tcMar>
+              <w:top w:type="dxa" w:w="80"/>
+              <w:left w:type="dxa" w:w="160"/>
+              <w:bottom w:type="dxa" w:w="80"/>
+              <w:right w:type="dxa" w:w="160"/>
+            </w:tcMar>
+          </w:tcPr>
+          <w:p>
+            <w:r>
+              <w:rPr>
+                <w:rFonts w:ascii="Arial" w:cs="Arial" w:eastAsia="Arial" w:hAnsi="Arial"/>
+                <w:b/>
+                <w:bCs/>
+                <w:color w:val="1A1A1A"/>
+                <w:sz w:val="20"/>
+                <w:szCs w:val="20"/>
+              </w:rPr>
+              <w:t xml:space="preserve">B.6</w:t>
+            </w:r>
+          </w:p>
+        </w:tc>
+        <w:tc>
+          <w:tcPr>
+            <w:tcW w:type="dxa" w:w="4680"/>
+            <w:tcBorders>
+              <w:top w:val="single" w:color="E8DDD0" w:sz="1"/>
+              <w:left w:val="single" w:color="E8DDD0" w:sz="1"/>
+              <w:bottom w:val="single" w:color="E8DDD0" w:sz="1"/>
+              <w:right w:val="single" w:color="E8DDD0" w:sz="1"/>
+            </w:tcBorders>
+            <w:shd w:fill="FAF3E8" w:val="clear"/>
+            <w:tcMar>
+              <w:top w:type="dxa" w:w="80"/>
+              <w:left w:type="dxa" w:w="160"/>
+              <w:bottom w:type="dxa" w:w="80"/>
+              <w:right w:type="dxa" w:w="160"/>
+            </w:tcMar>
+          </w:tcPr>
+          <w:p>
+            <w:r>
+              <w:rPr>
+                <w:rFonts w:ascii="Arial" w:cs="Arial" w:eastAsia="Arial" w:hAnsi="Arial"/>
+                <w:b w:val="false"/>
+                <w:bCs w:val="false"/>
+                <w:color w:val="1A1A1A"/>
+                <w:sz w:val="20"/>
+                <w:szCs w:val="20"/>
+              </w:rPr>
+              <w:t xml:space="preserve">RELAIS_X25519_SK_DEV interdit en prod. HCV KV v2 obligatoire. /health sonde sys/health.</w:t>
+            </w:r>
+          </w:p>
+        </w:tc>
+      </w:tr>
+      <w:tr>
+        <w:tc>
+          <w:tcPr>
+            <w:tcW w:type="dxa" w:w="4680"/>
+            <w:tcBorders>
+              <w:top w:val="single" w:color="E8DDD0" w:sz="1"/>
+              <w:left w:val="single" w:color="E8DDD0" w:sz="1"/>
+              <w:bottom w:val="single" w:color="E8DDD0" w:sz="1"/>
+              <w:right w:val="single" w:color="E8DDD0" w:sz="1"/>
+            </w:tcBorders>
+            <w:shd w:fill="FFFFFF" w:val="clear"/>
+            <w:tcMar>
+              <w:top w:type="dxa" w:w="80"/>
+              <w:left w:type="dxa" w:w="160"/>
+              <w:bottom w:type="dxa" w:w="80"/>
+              <w:right w:type="dxa" w:w="160"/>
+            </w:tcMar>
+          </w:tcPr>
+          <w:p>
+            <w:r>
+              <w:rPr>
+                <w:rFonts w:ascii="Arial" w:cs="Arial" w:eastAsia="Arial" w:hAnsi="Arial"/>
+                <w:b/>
+                <w:bCs/>
+                <w:color w:val="1A1A1A"/>
+                <w:sz w:val="20"/>
+                <w:szCs w:val="20"/>
+              </w:rPr>
+              <w:t xml:space="preserve">B.7</w:t>
+            </w:r>
+          </w:p>
+        </w:tc>
+        <w:tc>
+          <w:tcPr>
+            <w:tcW w:type="dxa" w:w="4680"/>
+            <w:tcBorders>
+              <w:top w:val="single" w:color="E8DDD0" w:sz="1"/>
+              <w:left w:val="single" w:color="E8DDD0" w:sz="1"/>
+              <w:bottom w:val="single" w:color="E8DDD0" w:sz="1"/>
+              <w:right w:val="single" w:color="E8DDD0" w:sz="1"/>
+            </w:tcBorders>
+            <w:shd w:fill="FFFFFF" w:val="clear"/>
+            <w:tcMar>
+              <w:top w:type="dxa" w:w="80"/>
+              <w:left w:type="dxa" w:w="160"/>
+              <w:bottom w:type="dxa" w:w="80"/>
+              <w:right w:type="dxa" w:w="160"/>
+            </w:tcMar>
+          </w:tcPr>
+          <w:p>
+            <w:r>
+              <w:rPr>
+                <w:rFonts w:ascii="Arial" w:cs="Arial" w:eastAsia="Arial" w:hAnsi="Arial"/>
+                <w:b w:val="false"/>
+                <w:bCs w:val="false"/>
+                <w:color w:val="1A1A1A"/>
+                <w:sz w:val="20"/>
+                <w:szCs w:val="20"/>
+              </w:rPr>
+              <w:t xml:space="preserve">POST /auth/keys (pas PUT /auth/register/keys). Une seule fois après OTP.</w:t>
+            </w:r>
+          </w:p>
+        </w:tc>
+      </w:tr>
+      <w:tr>
+        <w:tc>
+          <w:tcPr>
+            <w:tcW w:type="dxa" w:w="4680"/>
+            <w:tcBorders>
+              <w:top w:val="single" w:color="E8DDD0" w:sz="1"/>
+              <w:left w:val="single" w:color="E8DDD0" w:sz="1"/>
+              <w:bottom w:val="single" w:color="E8DDD0" w:sz="1"/>
+              <w:right w:val="single" w:color="E8DDD0" w:sz="1"/>
+            </w:tcBorders>
+            <w:shd w:fill="FAF3E8" w:val="clear"/>
+            <w:tcMar>
+              <w:top w:type="dxa" w:w="80"/>
+              <w:left w:type="dxa" w:w="160"/>
+              <w:bottom w:type="dxa" w:w="80"/>
+              <w:right w:type="dxa" w:w="160"/>
+            </w:tcMar>
+          </w:tcPr>
+          <w:p>
+            <w:r>
+              <w:rPr>
+                <w:rFonts w:ascii="Arial" w:cs="Arial" w:eastAsia="Arial" w:hAnsi="Arial"/>
+                <w:b/>
+                <w:bCs/>
+                <w:color w:val="1A1A1A"/>
+                <w:sz w:val="20"/>
+                <w:szCs w:val="20"/>
+              </w:rPr>
+              <w:t xml:space="preserve">D.1</w:t>
+            </w:r>
+          </w:p>
+        </w:tc>
+        <w:tc>
+          <w:tcPr>
+            <w:tcW w:type="dxa" w:w="4680"/>
+            <w:tcBorders>
+              <w:top w:val="single" w:color="E8DDD0" w:sz="1"/>
+              <w:left w:val="single" w:color="E8DDD0" w:sz="1"/>
+              <w:bottom w:val="single" w:color="E8DDD0" w:sz="1"/>
+              <w:right w:val="single" w:color="E8DDD0" w:sz="1"/>
+            </w:tcBorders>
+            <w:shd w:fill="FAF3E8" w:val="clear"/>
+            <w:tcMar>
+              <w:top w:type="dxa" w:w="80"/>
+              <w:left w:type="dxa" w:w="160"/>
+              <w:bottom w:type="dxa" w:w="80"/>
+              <w:right w:type="dxa" w:w="160"/>
+            </w:tcMar>
+          </w:tcPr>
+          <w:p>
+            <w:r>
+              <w:rPr>
+                <w:rFonts w:ascii="Arial" w:cs="Arial" w:eastAsia="Arial" w:hAnsi="Arial"/>
+                <w:b w:val="false"/>
+                <w:bCs w:val="false"/>
+                <w:color w:val="1A1A1A"/>
+                <w:sz w:val="20"/>
+                <w:szCs w:val="20"/>
+              </w:rPr>
+              <w:t xml:space="preserve">POST /auth/2fa/verify retourne 8 codes à l'activation. recovery_code accepté au login.</w:t>
+            </w:r>
+          </w:p>
+        </w:tc>
+      </w:tr>
+      <w:tr>
+        <w:tc>
+          <w:tcPr>
+            <w:tcW w:type="dxa" w:w="4680"/>
+            <w:tcBorders>
+              <w:top w:val="single" w:color="E8DDD0" w:sz="1"/>
+              <w:left w:val="single" w:color="E8DDD0" w:sz="1"/>
+              <w:bottom w:val="single" w:color="E8DDD0" w:sz="1"/>
+              <w:right w:val="single" w:color="E8DDD0" w:sz="1"/>
+            </w:tcBorders>
+            <w:shd w:fill="FFFFFF" w:val="clear"/>
+            <w:tcMar>
+              <w:top w:type="dxa" w:w="80"/>
+              <w:left w:type="dxa" w:w="160"/>
+              <w:bottom w:type="dxa" w:w="80"/>
+              <w:right w:type="dxa" w:w="160"/>
+            </w:tcMar>
+          </w:tcPr>
+          <w:p>
+            <w:r>
+              <w:rPr>
+                <w:rFonts w:ascii="Arial" w:cs="Arial" w:eastAsia="Arial" w:hAnsi="Arial"/>
+                <w:b/>
+                <w:bCs/>
+                <w:color w:val="1A1A1A"/>
+                <w:sz w:val="20"/>
+                <w:szCs w:val="20"/>
+              </w:rPr>
+              <w:t xml:space="preserve">D.2</w:t>
+            </w:r>
+          </w:p>
+        </w:tc>
+        <w:tc>
+          <w:tcPr>
+            <w:tcW w:type="dxa" w:w="4680"/>
+            <w:tcBorders>
+              <w:top w:val="single" w:color="E8DDD0" w:sz="1"/>
+              <w:left w:val="single" w:color="E8DDD0" w:sz="1"/>
+              <w:bottom w:val="single" w:color="E8DDD0" w:sz="1"/>
+              <w:right w:val="single" w:color="E8DDD0" w:sz="1"/>
+            </w:tcBorders>
+            <w:shd w:fill="FFFFFF" w:val="clear"/>
+            <w:tcMar>
+              <w:top w:type="dxa" w:w="80"/>
+              <w:left w:type="dxa" w:w="160"/>
+              <w:bottom w:type="dxa" w:w="80"/>
+              <w:right w:type="dxa" w:w="160"/>
+            </w:tcMar>
+          </w:tcPr>
+          <w:p>
+            <w:r>
+              <w:rPr>
+                <w:rFonts w:ascii="Arial" w:cs="Arial" w:eastAsia="Arial" w:hAnsi="Arial"/>
+                <w:b w:val="false"/>
+                <w:bCs w:val="false"/>
+                <w:color w:val="1A1A1A"/>
+                <w:sz w:val="20"/>
+                <w:szCs w:val="20"/>
+              </w:rPr>
+              <w:t xml:space="preserve">notification_enc inclut owner_display_name (60 chars max).</w:t>
+            </w:r>
+          </w:p>
+        </w:tc>
+      </w:tr>
+      <w:tr>
+        <w:tc>
+          <w:tcPr>
+            <w:tcW w:type="dxa" w:w="4680"/>
+            <w:tcBorders>
+              <w:top w:val="single" w:color="E8DDD0" w:sz="1"/>
+              <w:left w:val="single" w:color="E8DDD0" w:sz="1"/>
+              <w:bottom w:val="single" w:color="E8DDD0" w:sz="1"/>
+              <w:right w:val="single" w:color="E8DDD0" w:sz="1"/>
+            </w:tcBorders>
+            <w:shd w:fill="FAF3E8" w:val="clear"/>
+            <w:tcMar>
+              <w:top w:type="dxa" w:w="80"/>
+              <w:left w:type="dxa" w:w="160"/>
+              <w:bottom w:type="dxa" w:w="80"/>
+              <w:right w:type="dxa" w:w="160"/>
+            </w:tcMar>
+          </w:tcPr>
+          <w:p>
+            <w:r>
+              <w:rPr>
+                <w:rFonts w:ascii="Arial" w:cs="Arial" w:eastAsia="Arial" w:hAnsi="Arial"/>
+                <w:b/>
+                <w:bCs/>
+                <w:color w:val="1A1A1A"/>
+                <w:sz w:val="20"/>
+                <w:szCs w:val="20"/>
+              </w:rPr>
+              <w:t xml:space="preserve">D.3</w:t>
+            </w:r>
+          </w:p>
+        </w:tc>
+        <w:tc>
+          <w:tcPr>
+            <w:tcW w:type="dxa" w:w="4680"/>
+            <w:tcBorders>
+              <w:top w:val="single" w:color="E8DDD0" w:sz="1"/>
+              <w:left w:val="single" w:color="E8DDD0" w:sz="1"/>
+              <w:bottom w:val="single" w:color="E8DDD0" w:sz="1"/>
+              <w:right w:val="single" w:color="E8DDD0" w:sz="1"/>
+            </w:tcBorders>
+            <w:shd w:fill="FAF3E8" w:val="clear"/>
+            <w:tcMar>
+              <w:top w:type="dxa" w:w="80"/>
+              <w:left w:type="dxa" w:w="160"/>
+              <w:bottom w:type="dxa" w:w="80"/>
+              <w:right w:type="dxa" w:w="160"/>
+            </w:tcMar>
+          </w:tcPr>
+          <w:p>
+            <w:r>
+              <w:rPr>
+                <w:rFonts w:ascii="Arial" w:cs="Arial" w:eastAsia="Arial" w:hAnsi="Arial"/>
+                <w:b w:val="false"/>
+                <w:bCs w:val="false"/>
+                <w:color w:val="1A1A1A"/>
+                <w:sz w:val="20"/>
+                <w:szCs w:val="20"/>
+              </w:rPr>
+              <w:t xml:space="preserve">plain_hash + plain_sig à l'activation. RELAY_SHARE_INVALID (422) si hash ≠.</w:t>
+            </w:r>
+          </w:p>
+        </w:tc>
+      </w:tr>
+      <w:tr>
+        <w:tc>
+          <w:tcPr>
+            <w:tcW w:type="dxa" w:w="4680"/>
+            <w:tcBorders>
+              <w:top w:val="single" w:color="E8DDD0" w:sz="1"/>
+              <w:left w:val="single" w:color="E8DDD0" w:sz="1"/>
+              <w:bottom w:val="single" w:color="E8DDD0" w:sz="1"/>
+              <w:right w:val="single" w:color="E8DDD0" w:sz="1"/>
+            </w:tcBorders>
+            <w:shd w:fill="FFFFFF" w:val="clear"/>
+            <w:tcMar>
+              <w:top w:type="dxa" w:w="80"/>
+              <w:left w:type="dxa" w:w="160"/>
+              <w:bottom w:type="dxa" w:w="80"/>
+              <w:right w:type="dxa" w:w="160"/>
+            </w:tcMar>
+          </w:tcPr>
+          <w:p>
+            <w:r>
+              <w:rPr>
+                <w:rFonts w:ascii="Arial" w:cs="Arial" w:eastAsia="Arial" w:hAnsi="Arial"/>
+                <w:b/>
+                <w:bCs/>
+                <w:color w:val="1A1A1A"/>
+                <w:sz w:val="20"/>
+                <w:szCs w:val="20"/>
+              </w:rPr>
+              <w:t xml:space="preserve">D.4</w:t>
+            </w:r>
+          </w:p>
+        </w:tc>
+        <w:tc>
+          <w:tcPr>
+            <w:tcW w:type="dxa" w:w="4680"/>
+            <w:tcBorders>
+              <w:top w:val="single" w:color="E8DDD0" w:sz="1"/>
+              <w:left w:val="single" w:color="E8DDD0" w:sz="1"/>
+              <w:bottom w:val="single" w:color="E8DDD0" w:sz="1"/>
+              <w:right w:val="single" w:color="E8DDD0" w:sz="1"/>
+            </w:tcBorders>
+            <w:shd w:fill="FFFFFF" w:val="clear"/>
+            <w:tcMar>
+              <w:top w:type="dxa" w:w="80"/>
+              <w:left w:type="dxa" w:w="160"/>
+              <w:bottom w:type="dxa" w:w="80"/>
+              <w:right w:type="dxa" w:w="160"/>
+            </w:tcMar>
+          </w:tcPr>
+          <w:p>
+            <w:r>
+              <w:rPr>
+                <w:rFonts w:ascii="Arial" w:cs="Arial" w:eastAsia="Arial" w:hAnsi="Arial"/>
+                <w:b w:val="false"/>
+                <w:bCs w:val="false"/>
+                <w:color w:val="1A1A1A"/>
+                <w:sz w:val="20"/>
+                <w:szCs w:val="20"/>
+              </w:rPr>
+              <w:t xml:space="preserve">contact_progress email. relay:cleanup plafonné à dms.relay_max_restarts (3). transmission_stalled.</w:t>
+            </w:r>
+          </w:p>
+        </w:tc>
+      </w:tr>
+      <w:tr>
+        <w:tc>
+          <w:tcPr>
+            <w:tcW w:type="dxa" w:w="4680"/>
+            <w:tcBorders>
+              <w:top w:val="single" w:color="E8DDD0" w:sz="1"/>
+              <w:left w:val="single" w:color="E8DDD0" w:sz="1"/>
+              <w:bottom w:val="single" w:color="E8DDD0" w:sz="1"/>
+              <w:right w:val="single" w:color="E8DDD0" w:sz="1"/>
+            </w:tcBorders>
+            <w:shd w:fill="FAF3E8" w:val="clear"/>
+            <w:tcMar>
+              <w:top w:type="dxa" w:w="80"/>
+              <w:left w:type="dxa" w:w="160"/>
+              <w:bottom w:type="dxa" w:w="80"/>
+              <w:right w:type="dxa" w:w="160"/>
+            </w:tcMar>
+          </w:tcPr>
+          <w:p>
+            <w:r>
+              <w:rPr>
+                <w:rFonts w:ascii="Arial" w:cs="Arial" w:eastAsia="Arial" w:hAnsi="Arial"/>
+                <w:b/>
+                <w:bCs/>
+                <w:color w:val="1A1A1A"/>
+                <w:sz w:val="20"/>
+                <w:szCs w:val="20"/>
+              </w:rPr>
+              <w:t xml:space="preserve">D.5</w:t>
+            </w:r>
+          </w:p>
+        </w:tc>
+        <w:tc>
+          <w:tcPr>
+            <w:tcW w:type="dxa" w:w="4680"/>
+            <w:tcBorders>
+              <w:top w:val="single" w:color="E8DDD0" w:sz="1"/>
+              <w:left w:val="single" w:color="E8DDD0" w:sz="1"/>
+              <w:bottom w:val="single" w:color="E8DDD0" w:sz="1"/>
+              <w:right w:val="single" w:color="E8DDD0" w:sz="1"/>
+            </w:tcBorders>
+            <w:shd w:fill="FAF3E8" w:val="clear"/>
+            <w:tcMar>
+              <w:top w:type="dxa" w:w="80"/>
+              <w:left w:type="dxa" w:w="160"/>
+              <w:bottom w:type="dxa" w:w="80"/>
+              <w:right w:type="dxa" w:w="160"/>
+            </w:tcMar>
+          </w:tcPr>
+          <w:p>
+            <w:r>
+              <w:rPr>
+                <w:rFonts w:ascii="Arial" w:cs="Arial" w:eastAsia="Arial" w:hAnsi="Arial"/>
+                <w:b w:val="false"/>
+                <w:bCs w:val="false"/>
+                <w:color w:val="1A1A1A"/>
+                <w:sz w:val="20"/>
+                <w:szCs w:val="20"/>
+              </w:rPr>
+              <w:t xml:space="preserve">GET /admin/logs/api supprimé. Alerte erreur API → outil externe (Loki/Datadog).</w:t>
+            </w:r>
+          </w:p>
+        </w:tc>
+      </w:tr>
+      <w:tr>
+        <w:tc>
+          <w:tcPr>
+            <w:tcW w:type="dxa" w:w="4680"/>
+            <w:tcBorders>
+              <w:top w:val="single" w:color="E8DDD0" w:sz="1"/>
+              <w:left w:val="single" w:color="E8DDD0" w:sz="1"/>
+              <w:bottom w:val="single" w:color="E8DDD0" w:sz="1"/>
+              <w:right w:val="single" w:color="E8DDD0" w:sz="1"/>
+            </w:tcBorders>
+            <w:shd w:fill="FFFFFF" w:val="clear"/>
+            <w:tcMar>
+              <w:top w:type="dxa" w:w="80"/>
+              <w:left w:type="dxa" w:w="160"/>
+              <w:bottom w:type="dxa" w:w="80"/>
+              <w:right w:type="dxa" w:w="160"/>
+            </w:tcMar>
+          </w:tcPr>
+          <w:p>
+            <w:r>
+              <w:rPr>
+                <w:rFonts w:ascii="Arial" w:cs="Arial" w:eastAsia="Arial" w:hAnsi="Arial"/>
+                <w:b/>
+                <w:bCs/>
+                <w:color w:val="1A1A1A"/>
+                <w:sz w:val="20"/>
+                <w:szCs w:val="20"/>
+              </w:rPr>
+              <w:t xml:space="preserve">Audit</w:t>
+            </w:r>
+          </w:p>
+        </w:tc>
+        <w:tc>
+          <w:tcPr>
+            <w:tcW w:type="dxa" w:w="4680"/>
+            <w:tcBorders>
+              <w:top w:val="single" w:color="E8DDD0" w:sz="1"/>
+              <w:left w:val="single" w:color="E8DDD0" w:sz="1"/>
+              <w:bottom w:val="single" w:color="E8DDD0" w:sz="1"/>
+              <w:right w:val="single" w:color="E8DDD0" w:sz="1"/>
+            </w:tcBorders>
+            <w:shd w:fill="FFFFFF" w:val="clear"/>
+            <w:tcMar>
+              <w:top w:type="dxa" w:w="80"/>
+              <w:left w:type="dxa" w:w="160"/>
+              <w:bottom w:type="dxa" w:w="80"/>
+              <w:right w:type="dxa" w:w="160"/>
+            </w:tcMar>
+          </w:tcPr>
+          <w:p>
+            <w:r>
+              <w:rPr>
+                <w:rFonts w:ascii="Arial" w:cs="Arial" w:eastAsia="Arial" w:hAnsi="Arial"/>
+                <w:b w:val="false"/>
+                <w:bCs w:val="false"/>
+                <w:color w:val="1A1A1A"/>
+                <w:sz w:val="20"/>
+                <w:szCs w:val="20"/>
+              </w:rPr>
+              <w:t xml:space="preserve">Signature vault : SHA256(category+ts+P2). ts dans body. Rejet si ts &gt; 5min.</w:t>
+            </w:r>
+          </w:p>
+        </w:tc>
+      </w:tr>
+    </w:tbl>
+    <w:p>
+      <w:pPr>
+        <w:spacing w:after="0" w:before="120"/>
+      </w:pPr>
+      <w:r>
+        <w:t xml:space="preserve"/>
+      </w:r>
+    </w:p>
+    <w:p>
+      <w:pPr>
+        <w:pStyle w:val="Heading2"/>
+        <w:spacing w:after="120" w:before="320"/>
+      </w:pPr>
+      <w:r>
+        <w:rPr>
+          <w:rFonts w:ascii="Arial" w:cs="Arial" w:eastAsia="Arial" w:hAnsi="Arial"/>
+          <w:b/>
+          <w:bCs/>
+          <w:color w:val="5C3A0F"/>
+          <w:sz w:val="28"/>
+          <w:szCs w:val="28"/>
+        </w:rPr>
+        <w:t xml:space="preserve">§2.1 POST /auth/keys (B.7) + codes récupération (D.1)</w:t>
+      </w:r>
+    </w:p>
+    <w:tbl>
+      <w:tblPr>
+        <w:tblW w:type="dxa" w:w="9360"/>
+        <w:tblBorders>
+          <w:top w:val="single" w:color="auto" w:sz="4"/>
+          <w:left w:val="single" w:color="auto" w:sz="4"/>
+          <w:bottom w:val="single" w:color="auto" w:sz="4"/>
+          <w:right w:val="single" w:color="auto" w:sz="4"/>
+          <w:insideH w:val="single" w:color="auto" w:sz="4"/>
+          <w:insideV w:val="single" w:color="auto" w:sz="4"/>
+        </w:tblBorders>
+      </w:tblPr>
+      <w:tblGrid>
+        <w:gridCol w:w="9360"/>
+      </w:tblGrid>
+      <w:tr>
+        <w:tc>
+          <w:tcPr>
+            <w:tcW w:type="dxa" w:w="9360"/>
+            <w:tcBorders>
+              <w:top w:val="single" w:color="D4C5A9" w:sz="1"/>
+              <w:left w:val="single" w:color="F4A335" w:sz="6"/>
+              <w:bottom w:val="single" w:color="D4C5A9" w:sz="1"/>
+              <w:right w:val="single" w:color="D4C5A9" w:sz="1"/>
+            </w:tcBorders>
+            <w:shd w:fill="F5F0E8" w:val="clear"/>
+            <w:tcMar>
+              <w:top w:type="dxa" w:w="160"/>
+              <w:left w:type="dxa" w:w="240"/>
+              <w:bottom w:type="dxa" w:w="160"/>
+              <w:right w:type="dxa" w:w="240"/>
+            </w:tcMar>
+          </w:tcPr>
+          <w:p>
+            <w:pPr>
+              <w:spacing w:after="0" w:before="0"/>
+            </w:pPr>
+            <w:r>
+              <w:rPr>
+                <w:rFonts w:ascii="Courier New" w:cs="Courier New" w:eastAsia="Courier New" w:hAnsi="Courier New"/>
+                <w:color w:val="888888"/>
+                <w:sz w:val="18"/>
+                <w:szCs w:val="18"/>
+              </w:rPr>
+              <w:t xml:space="preserve">-- B.7 : endpoint correct</w:t>
+            </w:r>
+          </w:p>
+          <w:p>
+            <w:pPr>
+              <w:spacing w:after="0" w:before="0"/>
+            </w:pPr>
+            <w:r>
+              <w:rPr>
+                <w:rFonts w:ascii="Courier New" w:cs="Courier New" w:eastAsia="Courier New" w:hAnsi="Courier New"/>
+                <w:color w:val="1A1A1A"/>
+                <w:sz w:val="18"/>
+                <w:szCs w:val="18"/>
+              </w:rPr>
+              <w:t xml:space="preserve">POST /auth/keys { ed25519_pk: base64 }  -- une seule fois après OTP</w:t>
+            </w:r>
+          </w:p>
+          <w:p>
+            <w:pPr>
+              <w:spacing w:after="0" w:before="0"/>
+            </w:pPr>
+            <w:r>
+              <w:rPr>
+                <w:rFonts w:ascii="Courier New" w:cs="Courier New" w:eastAsia="Courier New" w:hAnsi="Courier New"/>
+                <w:color w:val="1A1A1A"/>
+                <w:sz w:val="18"/>
+                <w:szCs w:val="18"/>
+              </w:rPr>
+              <w:t xml:space="preserve"/>
+            </w:r>
+          </w:p>
+          <w:p>
+            <w:pPr>
+              <w:spacing w:after="0" w:before="0"/>
+            </w:pPr>
+            <w:r>
+              <w:rPr>
+                <w:rFonts w:ascii="Courier New" w:cs="Courier New" w:eastAsia="Courier New" w:hAnsi="Courier New"/>
+                <w:color w:val="888888"/>
+                <w:sz w:val="18"/>
+                <w:szCs w:val="18"/>
+              </w:rPr>
+              <w:t xml:space="preserve">-- D.1 : codes de récupération 2FA</w:t>
+            </w:r>
+          </w:p>
+          <w:p>
+            <w:pPr>
+              <w:spacing w:after="0" w:before="0"/>
+            </w:pPr>
+            <w:r>
+              <w:rPr>
+                <w:rFonts w:ascii="Courier New" w:cs="Courier New" w:eastAsia="Courier New" w:hAnsi="Courier New"/>
+                <w:color w:val="1A1A1A"/>
+                <w:sz w:val="18"/>
+                <w:szCs w:val="18"/>
+              </w:rPr>
+              <w:t xml:space="preserve">POST /auth/2fa/verify</w:t>
+            </w:r>
+          </w:p>
+          <w:p>
+            <w:pPr>
+              <w:spacing w:after="0" w:before="0"/>
+            </w:pPr>
+            <w:r>
+              <w:rPr>
+                <w:rFonts w:ascii="Courier New" w:cs="Courier New" w:eastAsia="Courier New" w:hAnsi="Courier New"/>
+                <w:color w:val="1A1A1A"/>
+                <w:sz w:val="18"/>
+                <w:szCs w:val="18"/>
+              </w:rPr>
+              <w:t xml:space="preserve">  À l'ACTIVATION : Returns: { verified: true, recovery_codes: string[8] }</w:t>
+            </w:r>
+          </w:p>
+          <w:p>
+            <w:pPr>
+              <w:spacing w:after="0" w:before="0"/>
+            </w:pPr>
+            <w:r>
+              <w:rPr>
+                <w:rFonts w:ascii="Courier New" w:cs="Courier New" w:eastAsia="Courier New" w:hAnsi="Courier New"/>
+                <w:color w:val="1A1A1A"/>
+                <w:sz w:val="18"/>
+                <w:szCs w:val="18"/>
+              </w:rPr>
+              <w:t xml:space="preserve">  Au LOGIN       : Body: { temp_token, totp_code } OU { temp_token, recovery_code }</w:t>
+            </w:r>
+          </w:p>
+        </w:tc>
+      </w:tr>
+    </w:tbl>
+    <w:p>
+      <w:pPr>
+        <w:spacing w:after="0" w:before="120"/>
+      </w:pPr>
+      <w:r>
+        <w:t xml:space="preserve"/>
+      </w:r>
+    </w:p>
+    <w:p>
+      <w:pPr>
+        <w:pStyle w:val="Heading2"/>
+        <w:spacing w:after="120" w:before="320"/>
+      </w:pPr>
+      <w:r>
+        <w:rPr>
+          <w:rFonts w:ascii="Arial" w:cs="Arial" w:eastAsia="Arial" w:hAnsi="Arial"/>
+          <w:b/>
+          <w:bCs/>
+          <w:color w:val="5C3A0F"/>
+          <w:sz w:val="28"/>
+          <w:szCs w:val="28"/>
+        </w:rPr>
+        <w:t xml:space="preserve">§3 Signature vault avec ts (audit sécurité)</w:t>
+      </w:r>
+    </w:p>
+    <w:tbl>
+      <w:tblPr>
+        <w:tblW w:type="dxa" w:w="9360"/>
+        <w:tblBorders>
+          <w:top w:val="single" w:color="auto" w:sz="4"/>
+          <w:left w:val="single" w:color="auto" w:sz="4"/>
+          <w:bottom w:val="single" w:color="auto" w:sz="4"/>
+          <w:right w:val="single" w:color="auto" w:sz="4"/>
+          <w:insideH w:val="single" w:color="auto" w:sz="4"/>
+          <w:insideV w:val="single" w:color="auto" w:sz="4"/>
+        </w:tblBorders>
+      </w:tblPr>
+      <w:tblGrid>
+        <w:gridCol w:w="9360"/>
+      </w:tblGrid>
+      <w:tr>
+        <w:tc>
+          <w:tcPr>
+            <w:tcW w:type="dxa" w:w="9360"/>
+            <w:tcBorders>
+              <w:top w:val="single" w:color="D4C5A9" w:sz="1"/>
+              <w:left w:val="single" w:color="F4A335" w:sz="6"/>
+              <w:bottom w:val="single" w:color="D4C5A9" w:sz="1"/>
+              <w:right w:val="single" w:color="D4C5A9" w:sz="1"/>
+            </w:tcBorders>
+            <w:shd w:fill="F5F0E8" w:val="clear"/>
+            <w:tcMar>
+              <w:top w:type="dxa" w:w="160"/>
+              <w:left w:type="dxa" w:w="240"/>
+              <w:bottom w:type="dxa" w:w="160"/>
+              <w:right w:type="dxa" w:w="240"/>
+            </w:tcMar>
+          </w:tcPr>
+          <w:p>
+            <w:pPr>
+              <w:spacing w:after="0" w:before="0"/>
+            </w:pPr>
+            <w:r>
+              <w:rPr>
+                <w:rFonts w:ascii="Courier New" w:cs="Courier New" w:eastAsia="Courier New" w:hAnsi="Courier New"/>
+                <w:color w:val="1A1A1A"/>
+                <w:sz w:val="18"/>
+                <w:szCs w:val="18"/>
+              </w:rPr>
+              <w:t xml:space="preserve">POST /vault/sync</w:t>
+            </w:r>
+          </w:p>
+          <w:p>
+            <w:pPr>
+              <w:spacing w:after="0" w:before="0"/>
+            </w:pPr>
+            <w:r>
+              <w:rPr>
+                <w:rFonts w:ascii="Courier New" w:cs="Courier New" w:eastAsia="Courier New" w:hAnsi="Courier New"/>
+                <w:color w:val="1A1A1A"/>
+                <w:sz w:val="18"/>
+                <w:szCs w:val="18"/>
+              </w:rPr>
+              <w:t xml:space="preserve">  Body: { category, ts, payload: base64(P2),</w:t>
+            </w:r>
+          </w:p>
+          <w:p>
+            <w:pPr>
+              <w:spacing w:after="0" w:before="0"/>
+            </w:pPr>
+            <w:r>
+              <w:rPr>
+                <w:rFonts w:ascii="Courier New" w:cs="Courier New" w:eastAsia="Courier New" w:hAnsi="Courier New"/>
+                <w:color w:val="1A1A1A"/>
+                <w:sz w:val="18"/>
+                <w:szCs w:val="18"/>
+              </w:rPr>
+              <w:t xml:space="preserve">          signature: base64(Ed25519.sign(SHA256(cat+ts+P2), sk)) }</w:t>
+            </w:r>
+          </w:p>
+          <w:p>
+            <w:pPr>
+              <w:spacing w:after="0" w:before="0"/>
+            </w:pPr>
+            <w:r>
+              <w:rPr>
+                <w:rFonts w:ascii="Courier New" w:cs="Courier New" w:eastAsia="Courier New" w:hAnsi="Courier New"/>
+                <w:color w:val="1A1A1A"/>
+                <w:sz w:val="18"/>
+                <w:szCs w:val="18"/>
+              </w:rPr>
+              <w:t xml:space="preserve">  Serveur : vérifie sig + rejette si |NOW()-ts| &gt; 5min</w:t>
+            </w:r>
+          </w:p>
+        </w:tc>
+      </w:tr>
+    </w:tbl>
+    <w:p>
+      <w:pPr>
+        <w:spacing w:after="0" w:before="120"/>
+      </w:pPr>
+      <w:r>
+        <w:t xml:space="preserve"/>
+      </w:r>
+    </w:p>
+    <w:p>
+      <w:pPr>
+        <w:pStyle w:val="Heading2"/>
+        <w:spacing w:after="120" w:before="320"/>
+      </w:pPr>
+      <w:r>
+        <w:rPr>
+          <w:rFonts w:ascii="Arial" w:cs="Arial" w:eastAsia="Arial" w:hAnsi="Arial"/>
+          <w:b/>
+          <w:bCs/>
+          <w:color w:val="5C3A0F"/>
+          <w:sz w:val="28"/>
+          <w:szCs w:val="28"/>
+        </w:rPr>
+        <w:t xml:space="preserve">§4.3 Activation (B.1, D.2, D.3)</w:t>
+      </w:r>
+    </w:p>
+    <w:tbl>
+      <w:tblPr>
+        <w:tblW w:type="dxa" w:w="9360"/>
+        <w:tblBorders>
+          <w:top w:val="single" w:color="auto" w:sz="4"/>
+          <w:left w:val="single" w:color="auto" w:sz="4"/>
+          <w:bottom w:val="single" w:color="auto" w:sz="4"/>
+          <w:right w:val="single" w:color="auto" w:sz="4"/>
+          <w:insideH w:val="single" w:color="auto" w:sz="4"/>
+          <w:insideV w:val="single" w:color="auto" w:sz="4"/>
+        </w:tblBorders>
+      </w:tblPr>
+      <w:tblGrid>
+        <w:gridCol w:w="9360"/>
+      </w:tblGrid>
+      <w:tr>
+        <w:tc>
+          <w:tcPr>
+            <w:tcW w:type="dxa" w:w="9360"/>
+            <w:tcBorders>
+              <w:top w:val="single" w:color="D4C5A9" w:sz="1"/>
+              <w:left w:val="single" w:color="F4A335" w:sz="6"/>
+              <w:bottom w:val="single" w:color="D4C5A9" w:sz="1"/>
+              <w:right w:val="single" w:color="D4C5A9" w:sz="1"/>
+            </w:tcBorders>
+            <w:shd w:fill="F5F0E8" w:val="clear"/>
+            <w:tcMar>
+              <w:top w:type="dxa" w:w="160"/>
+              <w:left w:type="dxa" w:w="240"/>
+              <w:bottom w:type="dxa" w:w="160"/>
+              <w:right w:type="dxa" w:w="240"/>
+            </w:tcMar>
+          </w:tcPr>
+          <w:p>
+            <w:pPr>
+              <w:spacing w:after="0" w:before="0"/>
+            </w:pPr>
+            <w:r>
+              <w:rPr>
+                <w:rFonts w:ascii="Courier New" w:cs="Courier New" w:eastAsia="Courier New" w:hAnsi="Courier New"/>
+                <w:color w:val="888888"/>
+                <w:sz w:val="18"/>
+                <w:szCs w:val="18"/>
+              </w:rPr>
+              <w:t xml:space="preserve">-- B.1 : client envoie octets (pas chemins Storj)</w:t>
+            </w:r>
+          </w:p>
+          <w:p>
+            <w:pPr>
+              <w:spacing w:after="0" w:before="0"/>
+            </w:pPr>
+            <w:r>
+              <w:rPr>
+                <w:rFonts w:ascii="Courier New" w:cs="Courier New" w:eastAsia="Courier New" w:hAnsi="Courier New"/>
+                <w:color w:val="1A1A1A"/>
+                <w:sz w:val="18"/>
+                <w:szCs w:val="18"/>
+              </w:rPr>
+              <w:t xml:space="preserve">shares.kN: { enc: base64(Si_enc), sig, plain_sig }</w:t>
+            </w:r>
+          </w:p>
+          <w:p>
+            <w:pPr>
+              <w:spacing w:after="0" w:before="0"/>
+            </w:pPr>
+            <w:r>
+              <w:rPr>
+                <w:rFonts w:ascii="Courier New" w:cs="Courier New" w:eastAsia="Courier New" w:hAnsi="Courier New"/>
+                <w:color w:val="888888"/>
+                <w:sz w:val="18"/>
+                <w:szCs w:val="18"/>
+              </w:rPr>
+              <w:t xml:space="preserve">-- Serveur : choisit storj_path, calcule SHA256(Si_enc), vérifie sig sur ce hash</w:t>
+            </w:r>
+          </w:p>
+          <w:p>
+            <w:pPr>
+              <w:spacing w:after="0" w:before="0"/>
+            </w:pPr>
+            <w:r>
+              <w:rPr>
+                <w:rFonts w:ascii="Courier New" w:cs="Courier New" w:eastAsia="Courier New" w:hAnsi="Courier New"/>
+                <w:color w:val="1A1A1A"/>
+                <w:sz w:val="18"/>
+                <w:szCs w:val="18"/>
+              </w:rPr>
+              <w:t xml:space="preserve"/>
+            </w:r>
+          </w:p>
+          <w:p>
+            <w:pPr>
+              <w:spacing w:after="0" w:before="0"/>
+            </w:pPr>
+            <w:r>
+              <w:rPr>
+                <w:rFonts w:ascii="Courier New" w:cs="Courier New" w:eastAsia="Courier New" w:hAnsi="Courier New"/>
+                <w:color w:val="888888"/>
+                <w:sz w:val="18"/>
+                <w:szCs w:val="18"/>
+              </w:rPr>
+              <w:t xml:space="preserve">-- D.2 : notification_enc = crypto_box_seal({email,phone,owner_display_name?}, pk)</w:t>
+            </w:r>
+          </w:p>
+          <w:p>
+            <w:pPr>
+              <w:spacing w:after="0" w:before="0"/>
+            </w:pPr>
+            <w:r>
+              <w:rPr>
+                <w:rFonts w:ascii="Courier New" w:cs="Courier New" w:eastAsia="Courier New" w:hAnsi="Courier New"/>
+                <w:color w:val="1A1A1A"/>
+                <w:sz w:val="18"/>
+                <w:szCs w:val="18"/>
+              </w:rPr>
+              <w:t xml:space="preserve"/>
+            </w:r>
+          </w:p>
+          <w:p>
+            <w:pPr>
+              <w:spacing w:after="0" w:before="0"/>
+            </w:pPr>
+            <w:r>
+              <w:rPr>
+                <w:rFonts w:ascii="Courier New" w:cs="Courier New" w:eastAsia="Courier New" w:hAnsi="Courier New"/>
+                <w:color w:val="888888"/>
+                <w:sz w:val="18"/>
+                <w:szCs w:val="18"/>
+              </w:rPr>
+              <w:t xml:space="preserve">-- D.3 : après vérification plain_sig</w:t>
+            </w:r>
+          </w:p>
+          <w:p>
+            <w:pPr>
+              <w:spacing w:after="0" w:before="0"/>
+            </w:pPr>
+            <w:r>
+              <w:rPr>
+                <w:rFonts w:ascii="Courier New" w:cs="Courier New" w:eastAsia="Courier New" w:hAnsi="Courier New"/>
+                <w:color w:val="1A1A1A"/>
+                <w:sz w:val="18"/>
+                <w:szCs w:val="18"/>
+              </w:rPr>
+              <w:t xml:space="preserve">share_kN_plain_hash stocké dans trusted_contacts (pour comparaison relay)</w:t>
+            </w:r>
+          </w:p>
+        </w:tc>
+      </w:tr>
+    </w:tbl>
+    <w:p>
+      <w:pPr>
+        <w:spacing w:after="0" w:before="120"/>
+      </w:pPr>
+      <w:r>
+        <w:t xml:space="preserve"/>
+      </w:r>
+    </w:p>
+    <w:p>
+      <w:pPr>
+        <w:pStyle w:val="Heading2"/>
+        <w:spacing w:after="120" w:before="320"/>
+      </w:pPr>
+      <w:r>
+        <w:rPr>
+          <w:rFonts w:ascii="Arial" w:cs="Arial" w:eastAsia="Arial" w:hAnsi="Arial"/>
+          <w:b/>
+          <w:bCs/>
+          <w:color w:val="5C3A0F"/>
+          <w:sz w:val="28"/>
+          <w:szCs w:val="28"/>
+        </w:rPr>
+        <w:t xml:space="preserve">§4.4 verify-contact (B.2)</w:t>
+      </w:r>
+    </w:p>
+    <w:tbl>
+      <w:tblPr>
+        <w:tblW w:type="dxa" w:w="9360"/>
+        <w:tblBorders>
+          <w:top w:val="single" w:color="auto" w:sz="4"/>
+          <w:left w:val="single" w:color="auto" w:sz="4"/>
+          <w:bottom w:val="single" w:color="auto" w:sz="4"/>
+          <w:right w:val="single" w:color="auto" w:sz="4"/>
+          <w:insideH w:val="single" w:color="auto" w:sz="4"/>
+          <w:insideV w:val="single" w:color="auto" w:sz="4"/>
+        </w:tblBorders>
+      </w:tblPr>
+      <w:tblGrid>
+        <w:gridCol w:w="9360"/>
+      </w:tblGrid>
+      <w:tr>
+        <w:tc>
+          <w:tcPr>
+            <w:tcW w:type="dxa" w:w="9360"/>
+            <w:tcBorders>
+              <w:top w:val="single" w:color="D4C5A9" w:sz="1"/>
+              <w:left w:val="single" w:color="F4A335" w:sz="6"/>
+              <w:bottom w:val="single" w:color="D4C5A9" w:sz="1"/>
+              <w:right w:val="single" w:color="D4C5A9" w:sz="1"/>
+            </w:tcBorders>
+            <w:shd w:fill="F5F0E8" w:val="clear"/>
+            <w:tcMar>
+              <w:top w:type="dxa" w:w="160"/>
+              <w:left w:type="dxa" w:w="240"/>
+              <w:bottom w:type="dxa" w:w="160"/>
+              <w:right w:type="dxa" w:w="240"/>
+            </w:tcMar>
+          </w:tcPr>
+          <w:p>
+            <w:pPr>
+              <w:spacing w:after="0" w:before="0"/>
+            </w:pPr>
+            <w:r>
+              <w:rPr>
+                <w:rFonts w:ascii="Courier New" w:cs="Courier New" w:eastAsia="Courier New" w:hAnsi="Courier New"/>
+                <w:color w:val="888888"/>
+                <w:sz w:val="18"/>
+                <w:szCs w:val="18"/>
+              </w:rPr>
+              <w:t xml:space="preserve">-- Ancien (incorrect) : POST /transmission/verify-contact/:id { verify_token_enc }</w:t>
+            </w:r>
+          </w:p>
+          <w:p>
+            <w:pPr>
+              <w:spacing w:after="0" w:before="0"/>
+            </w:pPr>
+            <w:r>
+              <w:rPr>
+                <w:rFonts w:ascii="Courier New" w:cs="Courier New" w:eastAsia="Courier New" w:hAnsi="Courier New"/>
+                <w:color w:val="888888"/>
+                <w:sz w:val="18"/>
+                <w:szCs w:val="18"/>
+              </w:rPr>
+              <w:t xml:space="preserve">-- Correct (B.2) :</w:t>
+            </w:r>
+          </w:p>
+          <w:p>
+            <w:pPr>
+              <w:spacing w:after="0" w:before="0"/>
+            </w:pPr>
+            <w:r>
+              <w:rPr>
+                <w:rFonts w:ascii="Courier New" w:cs="Courier New" w:eastAsia="Courier New" w:hAnsi="Courier New"/>
+                <w:color w:val="1A1A1A"/>
+                <w:sz w:val="18"/>
+                <w:szCs w:val="18"/>
+              </w:rPr>
+              <w:t xml:space="preserve">POST /transmission/contacts/:id/verify</w:t>
+            </w:r>
+          </w:p>
+          <w:p>
+            <w:pPr>
+              <w:spacing w:after="0" w:before="0"/>
+            </w:pPr>
+            <w:r>
+              <w:rPr>
+                <w:rFonts w:ascii="Courier New" w:cs="Courier New" w:eastAsia="Courier New" w:hAnsi="Courier New"/>
+                <w:color w:val="1A1A1A"/>
+                <w:sz w:val="18"/>
+                <w:szCs w:val="18"/>
+              </w:rPr>
+              <w:t xml:space="preserve">  Body: { signature: Ed25519.sign(SHA256(verify_token), owner_sk) }</w:t>
+            </w:r>
+          </w:p>
+          <w:p>
+            <w:pPr>
+              <w:spacing w:after="0" w:before="0"/>
+            </w:pPr>
+            <w:r>
+              <w:rPr>
+                <w:rFonts w:ascii="Courier New" w:cs="Courier New" w:eastAsia="Courier New" w:hAnsi="Courier New"/>
+                <w:color w:val="1A1A1A"/>
+                <w:sz w:val="18"/>
+                <w:szCs w:val="18"/>
+              </w:rPr>
+              <w:t xml:space="preserve">  → UPDATE verify_last_checked_at = NOW()</w:t>
+            </w:r>
+          </w:p>
+        </w:tc>
+      </w:tr>
+    </w:tbl>
+    <w:p>
+      <w:pPr>
+        <w:spacing w:after="0" w:before="120"/>
+      </w:pPr>
+      <w:r>
+        <w:t xml:space="preserve"/>
+      </w:r>
+    </w:p>
+    <w:p>
+      <w:pPr>
+        <w:pStyle w:val="Heading2"/>
+        <w:spacing w:after="120" w:before="320"/>
+      </w:pPr>
+      <w:r>
+        <w:rPr>
+          <w:rFonts w:ascii="Arial" w:cs="Arial" w:eastAsia="Arial" w:hAnsi="Arial"/>
+          <w:b/>
+          <w:bCs/>
+          <w:color w:val="5C3A0F"/>
+          <w:sz w:val="28"/>
+          <w:szCs w:val="28"/>
+        </w:rPr>
+        <w:t xml:space="preserve">§5 Check-in DEC-33 corrigé (B.3)</w:t>
+      </w:r>
+    </w:p>
+    <w:tbl>
+      <w:tblPr>
+        <w:tblW w:type="dxa" w:w="9360"/>
+        <w:tblBorders>
+          <w:top w:val="single" w:color="auto" w:sz="4"/>
+          <w:left w:val="single" w:color="auto" w:sz="4"/>
+          <w:bottom w:val="single" w:color="auto" w:sz="4"/>
+          <w:right w:val="single" w:color="auto" w:sz="4"/>
+          <w:insideH w:val="single" w:color="auto" w:sz="4"/>
+          <w:insideV w:val="single" w:color="auto" w:sz="4"/>
+        </w:tblBorders>
+      </w:tblPr>
+      <w:tblGrid>
+        <w:gridCol w:w="9360"/>
+      </w:tblGrid>
+      <w:tr>
+        <w:tc>
+          <w:tcPr>
+            <w:tcW w:type="dxa" w:w="9360"/>
+            <w:tcBorders>
+              <w:top w:val="single" w:color="D4C5A9" w:sz="1"/>
+              <w:left w:val="single" w:color="F4A335" w:sz="6"/>
+              <w:bottom w:val="single" w:color="D4C5A9" w:sz="1"/>
+              <w:right w:val="single" w:color="D4C5A9" w:sz="1"/>
+            </w:tcBorders>
+            <w:shd w:fill="F5F0E8" w:val="clear"/>
+            <w:tcMar>
+              <w:top w:type="dxa" w:w="160"/>
+              <w:left w:type="dxa" w:w="240"/>
+              <w:bottom w:type="dxa" w:w="160"/>
+              <w:right w:type="dxa" w:w="240"/>
+            </w:tcMar>
+          </w:tcPr>
+          <w:p>
+            <w:pPr>
+              <w:spacing w:after="0" w:before="0"/>
+            </w:pPr>
+            <w:r>
+              <w:rPr>
+                <w:rFonts w:ascii="Courier New" w:cs="Courier New" w:eastAsia="Courier New" w:hAnsi="Courier New"/>
+                <w:color w:val="888888"/>
+                <w:sz w:val="18"/>
+                <w:szCs w:val="18"/>
+              </w:rPr>
+              <w:t xml:space="preserve">-- checkin_questions : pas d'answer_hash dans le schéma</w:t>
+            </w:r>
+          </w:p>
+          <w:p>
+            <w:pPr>
+              <w:spacing w:after="0" w:before="0"/>
+            </w:pPr>
+            <w:r>
+              <w:rPr>
+                <w:rFonts w:ascii="Courier New" w:cs="Courier New" w:eastAsia="Courier New" w:hAnsi="Courier New"/>
+                <w:color w:val="888888"/>
+                <w:sz w:val="18"/>
+                <w:szCs w:val="18"/>
+              </w:rPr>
+              <w:t xml:space="preserve">-- Bibliothèque intégrée serveur : api/checkin/games.ts</w:t>
+            </w:r>
+          </w:p>
+          <w:p>
+            <w:pPr>
+              <w:spacing w:after="0" w:before="0"/>
+            </w:pPr>
+            <w:r>
+              <w:rPr>
+                <w:rFonts w:ascii="Courier New" w:cs="Courier New" w:eastAsia="Courier New" w:hAnsi="Courier New"/>
+                <w:color w:val="888888"/>
+                <w:sz w:val="18"/>
+                <w:szCs w:val="18"/>
+              </w:rPr>
+              <w:t xml:space="preserve">-- game_token opaque (réponse en Redis, jamais transmise au client)</w:t>
+            </w:r>
+          </w:p>
+          <w:p>
+            <w:pPr>
+              <w:spacing w:after="0" w:before="0"/>
+            </w:pPr>
+            <w:r>
+              <w:rPr>
+                <w:rFonts w:ascii="Courier New" w:cs="Courier New" w:eastAsia="Courier New" w:hAnsi="Courier New"/>
+                <w:color w:val="1A1A1A"/>
+                <w:sz w:val="18"/>
+                <w:szCs w:val="18"/>
+              </w:rPr>
+              <w:t xml:space="preserve">GET /checkin/game → { question_fr, question_en, game_type, game_token }</w:t>
+            </w:r>
+          </w:p>
+          <w:p>
+            <w:pPr>
+              <w:spacing w:after="0" w:before="0"/>
+            </w:pPr>
+            <w:r>
+              <w:rPr>
+                <w:rFonts w:ascii="Courier New" w:cs="Courier New" w:eastAsia="Courier New" w:hAnsi="Courier New"/>
+                <w:color w:val="1A1A1A"/>
+                <w:sz w:val="18"/>
+                <w:szCs w:val="18"/>
+              </w:rPr>
+              <w:t xml:space="preserve">POST /checkin/game/answer { game_token, answer_index } → checkin_token si correct</w:t>
+            </w:r>
+          </w:p>
+        </w:tc>
+      </w:tr>
+    </w:tbl>
+    <w:p>
+      <w:pPr>
+        <w:spacing w:after="0" w:before="120"/>
+      </w:pPr>
+      <w:r>
+        <w:t xml:space="preserve"/>
+      </w:r>
+    </w:p>
+    <w:p>
+      <w:pPr>
+        <w:pStyle w:val="Heading2"/>
+        <w:spacing w:after="120" w:before="320"/>
+      </w:pPr>
+      <w:r>
+        <w:rPr>
+          <w:rFonts w:ascii="Arial" w:cs="Arial" w:eastAsia="Arial" w:hAnsi="Arial"/>
+          <w:b/>
+          <w:bCs/>
+          <w:color w:val="5C3A0F"/>
+          <w:sz w:val="28"/>
+          <w:szCs w:val="28"/>
+        </w:rPr>
+        <w:t xml:space="preserve">§7 Relay (B.4, D.3)</w:t>
+      </w:r>
+    </w:p>
+    <w:tbl>
+      <w:tblPr>
+        <w:tblW w:type="dxa" w:w="9360"/>
+        <w:tblBorders>
+          <w:top w:val="single" w:color="auto" w:sz="4"/>
+          <w:left w:val="single" w:color="auto" w:sz="4"/>
+          <w:bottom w:val="single" w:color="auto" w:sz="4"/>
+          <w:right w:val="single" w:color="auto" w:sz="4"/>
+          <w:insideH w:val="single" w:color="auto" w:sz="4"/>
+          <w:insideV w:val="single" w:color="auto" w:sz="4"/>
+        </w:tblBorders>
+      </w:tblPr>
+      <w:tblGrid>
+        <w:gridCol w:w="9360"/>
+      </w:tblGrid>
+      <w:tr>
+        <w:tc>
+          <w:tcPr>
+            <w:tcW w:type="dxa" w:w="9360"/>
+            <w:tcBorders>
+              <w:top w:val="single" w:color="D4C5A9" w:sz="1"/>
+              <w:left w:val="single" w:color="F4A335" w:sz="6"/>
+              <w:bottom w:val="single" w:color="D4C5A9" w:sz="1"/>
+              <w:right w:val="single" w:color="D4C5A9" w:sz="1"/>
+            </w:tcBorders>
+            <w:shd w:fill="F5F0E8" w:val="clear"/>
+            <w:tcMar>
+              <w:top w:type="dxa" w:w="160"/>
+              <w:left w:type="dxa" w:w="240"/>
+              <w:bottom w:type="dxa" w:w="160"/>
+              <w:right w:type="dxa" w:w="240"/>
+            </w:tcMar>
+          </w:tcPr>
+          <w:p>
+            <w:pPr>
+              <w:spacing w:after="0" w:before="0"/>
+            </w:pPr>
+            <w:r>
+              <w:rPr>
+                <w:rFonts w:ascii="Courier New" w:cs="Courier New" w:eastAsia="Courier New" w:hAnsi="Courier New"/>
+                <w:color w:val="1A1A1A"/>
+                <w:sz w:val="18"/>
+                <w:szCs w:val="18"/>
+              </w:rPr>
+              <w:t xml:space="preserve">POST /relay/:token/verify</w:t>
+            </w:r>
+          </w:p>
+          <w:p>
+            <w:pPr>
+              <w:spacing w:after="0" w:before="0"/>
+            </w:pPr>
+            <w:r>
+              <w:rPr>
+                <w:rFonts w:ascii="Courier New" w:cs="Courier New" w:eastAsia="Courier New" w:hAnsi="Courier New"/>
+                <w:color w:val="1A1A1A"/>
+                <w:sz w:val="18"/>
+                <w:szCs w:val="18"/>
+              </w:rPr>
+              <w:t xml:space="preserve">  Body: { shares: { k1?: base64(S1_brut), k2?, k3? } }  -- B.4</w:t>
+            </w:r>
+          </w:p>
+          <w:p>
+            <w:pPr>
+              <w:spacing w:after="0" w:before="0"/>
+            </w:pPr>
+            <w:r>
+              <w:rPr>
+                <w:rFonts w:ascii="Courier New" w:cs="Courier New" w:eastAsia="Courier New" w:hAnsi="Courier New"/>
+                <w:color w:val="1A1A1A"/>
+                <w:sz w:val="18"/>
+                <w:szCs w:val="18"/>
+              </w:rPr>
+              <w:t xml:space="preserve">  OU   : { failed: true }</w:t>
+            </w:r>
+          </w:p>
+          <w:p>
+            <w:pPr>
+              <w:spacing w:after="0" w:before="0"/>
+            </w:pPr>
+            <w:r>
+              <w:rPr>
+                <w:rFonts w:ascii="Courier New" w:cs="Courier New" w:eastAsia="Courier New" w:hAnsi="Courier New"/>
+                <w:color w:val="1A1A1A"/>
+                <w:sz w:val="18"/>
+                <w:szCs w:val="18"/>
+              </w:rPr>
+              <w:t xml:space="preserve">  D.3 : Compare SHA256(S_kN_reçu) avec share_kN_plain_hash</w:t>
+            </w:r>
+          </w:p>
+          <w:p>
+            <w:pPr>
+              <w:spacing w:after="0" w:before="0"/>
+            </w:pPr>
+            <w:r>
+              <w:rPr>
+                <w:rFonts w:ascii="Courier New" w:cs="Courier New" w:eastAsia="Courier New" w:hAnsi="Courier New"/>
+                <w:color w:val="1A1A1A"/>
+                <w:sz w:val="18"/>
+                <w:szCs w:val="18"/>
+              </w:rPr>
+              <w:t xml:space="preserve">         Si ≠ → 422 RELAY_SHARE_INVALID, fail_count++</w:t>
+            </w:r>
+          </w:p>
+        </w:tc>
+      </w:tr>
+    </w:tbl>
+    <w:p>
+      <w:pPr>
+        <w:spacing w:after="0" w:before="120"/>
+      </w:pPr>
+      <w:r>
+        <w:t xml:space="preserve"/>
+      </w:r>
+    </w:p>
+    <w:p>
+      <w:pPr>
+        <w:pStyle w:val="Heading2"/>
+        <w:spacing w:after="120" w:before="320"/>
+      </w:pPr>
+      <w:r>
+        <w:rPr>
+          <w:rFonts w:ascii="Arial" w:cs="Arial" w:eastAsia="Arial" w:hAnsi="Arial"/>
+          <w:b/>
+          <w:bCs/>
+          <w:color w:val="5C3A0F"/>
+          <w:sz w:val="28"/>
+          <w:szCs w:val="28"/>
+        </w:rPr>
+        <w:t xml:space="preserve">§8 DMS relay:cleanup (D.4)</w:t>
+      </w:r>
+    </w:p>
+    <w:tbl>
+      <w:tblPr>
+        <w:tblW w:type="dxa" w:w="9360"/>
+        <w:tblBorders>
+          <w:top w:val="single" w:color="auto" w:sz="4"/>
+          <w:left w:val="single" w:color="auto" w:sz="4"/>
+          <w:bottom w:val="single" w:color="auto" w:sz="4"/>
+          <w:right w:val="single" w:color="auto" w:sz="4"/>
+          <w:insideH w:val="single" w:color="auto" w:sz="4"/>
+          <w:insideV w:val="single" w:color="auto" w:sz="4"/>
+        </w:tblBorders>
+      </w:tblPr>
+      <w:tblGrid>
+        <w:gridCol w:w="9360"/>
+      </w:tblGrid>
+      <w:tr>
+        <w:tc>
+          <w:tcPr>
+            <w:tcW w:type="dxa" w:w="9360"/>
+            <w:tcBorders>
+              <w:top w:val="single" w:color="D4C5A9" w:sz="1"/>
+              <w:left w:val="single" w:color="F4A335" w:sz="6"/>
+              <w:bottom w:val="single" w:color="D4C5A9" w:sz="1"/>
+              <w:right w:val="single" w:color="D4C5A9" w:sz="1"/>
+            </w:tcBorders>
+            <w:shd w:fill="F5F0E8" w:val="clear"/>
+            <w:tcMar>
+              <w:top w:type="dxa" w:w="160"/>
+              <w:left w:type="dxa" w:w="240"/>
+              <w:bottom w:type="dxa" w:w="160"/>
+              <w:right w:type="dxa" w:w="240"/>
+            </w:tcMar>
+          </w:tcPr>
+          <w:p>
+            <w:pPr>
+              <w:spacing w:after="0" w:before="0"/>
+            </w:pPr>
+            <w:r>
+              <w:rPr>
+                <w:rFonts w:ascii="Courier New" w:cs="Courier New" w:eastAsia="Courier New" w:hAnsi="Courier New"/>
+                <w:color w:val="1A1A1A"/>
+                <w:sz w:val="18"/>
+                <w:szCs w:val="18"/>
+              </w:rPr>
+              <w:t xml:space="preserve">const maxRestarts = getConfig('dms.relay_max_restarts')  // défaut 3</w:t>
+            </w:r>
+          </w:p>
+          <w:p>
+            <w:pPr>
+              <w:spacing w:after="0" w:before="0"/>
+            </w:pPr>
+            <w:r>
+              <w:rPr>
+                <w:rFonts w:ascii="Courier New" w:cs="Courier New" w:eastAsia="Courier New" w:hAnsi="Courier New"/>
+                <w:color w:val="1A1A1A"/>
+                <w:sz w:val="18"/>
+                <w:szCs w:val="18"/>
+              </w:rPr>
+              <w:t xml:space="preserve">const expiredCount = COUNT(transmissions WHERE status='expired' AND config_id=$1)</w:t>
+            </w:r>
+          </w:p>
+          <w:p>
+            <w:pPr>
+              <w:spacing w:after="0" w:before="0"/>
+            </w:pPr>
+            <w:r>
+              <w:rPr>
+                <w:rFonts w:ascii="Courier New" w:cs="Courier New" w:eastAsia="Courier New" w:hAnsi="Courier New"/>
+                <w:color w:val="1A1A1A"/>
+                <w:sz w:val="18"/>
+                <w:szCs w:val="18"/>
+              </w:rPr>
+              <w:t xml:space="preserve">if expiredCount &gt;= maxRestarts:</w:t>
+            </w:r>
+          </w:p>
+          <w:p>
+            <w:pPr>
+              <w:spacing w:after="0" w:before="0"/>
+            </w:pPr>
+            <w:r>
+              <w:rPr>
+                <w:rFonts w:ascii="Courier New" w:cs="Courier New" w:eastAsia="Courier New" w:hAnsi="Courier New"/>
+                <w:color w:val="1A1A1A"/>
+                <w:sz w:val="18"/>
+                <w:szCs w:val="18"/>
+              </w:rPr>
+              <w:t xml:space="preserve">  alerte transmission_stalled → dashboard</w:t>
+            </w:r>
+          </w:p>
+          <w:p>
+            <w:pPr>
+              <w:spacing w:after="0" w:before="0"/>
+            </w:pPr>
+            <w:r>
+              <w:rPr>
+                <w:rFonts w:ascii="Courier New" w:cs="Courier New" w:eastAsia="Courier New" w:hAnsi="Courier New"/>
+                <w:color w:val="1A1A1A"/>
+                <w:sz w:val="18"/>
+                <w:szCs w:val="18"/>
+              </w:rPr>
+              <w:t xml:space="preserve">  return  // ne pas relancer</w:t>
+            </w:r>
+          </w:p>
+        </w:tc>
+      </w:tr>
+    </w:tbl>
+    <w:p>
+      <w:pPr>
+        <w:spacing w:after="0" w:before="120"/>
+      </w:pPr>
+      <w:r>
+        <w:t xml:space="preserve"/>
+      </w:r>
+    </w:p>
+    <w:p>
+      <w:pPr>
+        <w:pStyle w:val="Heading2"/>
+        <w:spacing w:after="120" w:before="320"/>
+      </w:pPr>
+      <w:r>
+        <w:rPr>
+          <w:rFonts w:ascii="Arial" w:cs="Arial" w:eastAsia="Arial" w:hAnsi="Arial"/>
+          <w:b/>
+          <w:bCs/>
+          <w:color w:val="5C3A0F"/>
+          <w:sz w:val="28"/>
+          <w:szCs w:val="28"/>
+        </w:rPr>
+        <w:t xml:space="preserve">§9.1 Secrets (B.6)</w:t>
+      </w:r>
+    </w:p>
+    <w:tbl>
+      <w:tblPr>
+        <w:tblW w:type="dxa" w:w="9360"/>
+        <w:tblBorders>
+          <w:top w:val="single" w:color="auto" w:sz="4"/>
+          <w:left w:val="single" w:color="auto" w:sz="4"/>
+          <w:bottom w:val="single" w:color="auto" w:sz="4"/>
+          <w:right w:val="single" w:color="auto" w:sz="4"/>
+          <w:insideH w:val="single" w:color="auto" w:sz="4"/>
+          <w:insideV w:val="single" w:color="auto" w:sz="4"/>
+        </w:tblBorders>
+      </w:tblPr>
+      <w:tblGrid>
+        <w:gridCol w:w="9360"/>
+      </w:tblGrid>
+      <w:tr>
+        <w:tc>
+          <w:tcPr>
+            <w:tcW w:type="dxa" w:w="9360"/>
+            <w:tcBorders>
+              <w:top w:val="single" w:color="D4C5A9" w:sz="1"/>
+              <w:left w:val="single" w:color="F4A335" w:sz="6"/>
+              <w:bottom w:val="single" w:color="D4C5A9" w:sz="1"/>
+              <w:right w:val="single" w:color="D4C5A9" w:sz="1"/>
+            </w:tcBorders>
+            <w:shd w:fill="F5F0E8" w:val="clear"/>
+            <w:tcMar>
+              <w:top w:type="dxa" w:w="160"/>
+              <w:left w:type="dxa" w:w="240"/>
+              <w:bottom w:type="dxa" w:w="160"/>
+              <w:right w:type="dxa" w:w="240"/>
+            </w:tcMar>
+          </w:tcPr>
+          <w:p>
+            <w:pPr>
+              <w:spacing w:after="0" w:before="0"/>
+            </w:pPr>
+            <w:r>
+              <w:rPr>
+                <w:rFonts w:ascii="Courier New" w:cs="Courier New" w:eastAsia="Courier New" w:hAnsi="Courier New"/>
+                <w:color w:val="1A1A1A"/>
+                <w:sz w:val="18"/>
+                <w:szCs w:val="18"/>
+              </w:rPr>
+              <w:t xml:space="preserve">// HCV KV v2 OBLIGATOIRE en prod — pas de repli</w:t>
+            </w:r>
+          </w:p>
+          <w:p>
+            <w:pPr>
+              <w:spacing w:after="0" w:before="0"/>
+            </w:pPr>
+            <w:r>
+              <w:rPr>
+                <w:rFonts w:ascii="Courier New" w:cs="Courier New" w:eastAsia="Courier New" w:hAnsi="Courier New"/>
+                <w:color w:val="1A1A1A"/>
+                <w:sz w:val="18"/>
+                <w:szCs w:val="18"/>
+              </w:rPr>
+              <w:t xml:space="preserve">if isProd: return hcv.kvGet(HCV_SECRET_PATH, HCV_SECRET_FIELD)</w:t>
+            </w:r>
+          </w:p>
+          <w:p>
+            <w:pPr>
+              <w:spacing w:after="0" w:before="0"/>
+            </w:pPr>
+            <w:r>
+              <w:rPr>
+                <w:rFonts w:ascii="Courier New" w:cs="Courier New" w:eastAsia="Courier New" w:hAnsi="Courier New"/>
+                <w:color w:val="1A1A1A"/>
+                <w:sz w:val="18"/>
+                <w:szCs w:val="18"/>
+              </w:rPr>
+              <w:t xml:space="preserve">// RELAIS_X25519_SK_DEV interdit en prod</w:t>
+            </w:r>
+          </w:p>
+          <w:p>
+            <w:pPr>
+              <w:spacing w:after="0" w:before="0"/>
+            </w:pPr>
+            <w:r>
+              <w:rPr>
+                <w:rFonts w:ascii="Courier New" w:cs="Courier New" w:eastAsia="Courier New" w:hAnsi="Courier New"/>
+                <w:color w:val="1A1A1A"/>
+                <w:sz w:val="18"/>
+                <w:szCs w:val="18"/>
+              </w:rPr>
+              <w:t xml:space="preserve">// /health sonde {HCV_ADDR}/v1/sys/health</w:t>
+            </w:r>
+          </w:p>
+        </w:tc>
+      </w:tr>
+    </w:tbl>
+    <w:p>
+      <w:pPr>
+        <w:spacing w:after="0" w:before="120"/>
+      </w:pPr>
+      <w:r>
+        <w:t xml:space="preserve"/>
+      </w:r>
+    </w:p>
+    <w:p>
+      <w:pPr>
+        <w:pBdr>
+          <w:bottom w:val="single" w:color="C4A882" w:sz="4" w:space="1"/>
+        </w:pBdr>
+        <w:spacing w:after="240" w:before="240"/>
+      </w:pPr>
+      <w:r>
+        <w:t xml:space="preserve"/>
+      </w:r>
+    </w:p>
+    <w:p>
+      <w:pPr>
+        <w:spacing w:after="0" w:before="120"/>
+      </w:pPr>
+      <w:r>
+        <w:t xml:space="preserve"/>
+      </w:r>
+    </w:p>
+    <w:p>
+      <w:pPr>
         <w:spacing w:after="100" w:before="60"/>
       </w:pPr>
       <w:r>
@@ -5270,7 +7253,7 @@
           <w:sz w:val="22"/>
           <w:szCs w:val="22"/>
         </w:rPr>
-        <w:t xml:space="preserve">— Fin des Backend Specs v1.1</w:t>
+        <w:t xml:space="preserve">— Fin des Backend Specs v1.2</w:t>
       </w:r>
     </w:p>
     <w:sectPr>
@@ -5411,7 +7394,7 @@
         <w:sz w:val="18"/>
         <w:szCs w:val="18"/>
       </w:rPr>
-      <w:t xml:space="preserve">   —   Backend Specs v1.1</w:t>
+      <w:t xml:space="preserve">   —   Backend Specs v1.2</w:t>
     </w:r>
   </w:p>
 </w:hdr>

</xml_diff>